<commit_message>
v0.9.170: 阶段3 主权变硬证据 — W3-1 交叉矩阵 20→22格入电子域(X18 convergent + M4 model_limited·三域判据·探针12例) + W3-2 修复 GDS REAL8/UNITS 真 bug(gdstk 双向互操作 ALL PASS) + CI core 259→260 补登记(count 2 FAIL 收口) + 对外文档口径回改
</commit_message>
<xml_diff>
--- a/docs/LDA_商业计划书_v0.9.169_2026-10-01.docx
+++ b/docs/LDA_商业计划书_v0.9.169_2026-10-01.docx
@@ -282,7 +282,7 @@
           <w:sz w:val="21"/>
           <w:rFonts w:eastAsia="宋体"/>
         </w:rPr>
-        <w:t>：判决落物理定律锚 + 实证大数据锚，LLM 不进判决路径，PASS/FAIL 由死标量比对定（账本 476 / 独立率 95.59% / CI core 259）。</w:t>
+        <w:t>：判决落物理定律锚 + 实证大数据锚，LLM 不进判决路径，PASS/FAIL 由死标量比对定（账本 476 / 独立率 95.59% / CI core 260）。</w:t>
       </w:r>
     </w:p>
     <w:p>
@@ -1188,7 +1188,7 @@
                 <w:sz w:val="18"/>
                 <w:rFonts w:eastAsia="微软雅黑"/>
               </w:rPr>
-              <w:t>259 条全绿</w:t>
+              <w:t>260 条全绿</w:t>
             </w:r>
             <w:r>
               <w:rPr>
@@ -3284,7 +3284,7 @@
           <w:sz w:val="21"/>
           <w:rFonts w:eastAsia="宋体"/>
         </w:rPr>
-        <w:t>：物理定律锚（解析解/守恒量）+ 实证大数据锚（真实测量/同行结果），判据 D 防自证桩失真；CI core 259 条门禁；独立率 95.59%。</w:t>
+        <w:t>：物理定律锚（解析解/守恒量）+ 实证大数据锚（真实测量/同行结果），判据 D 防自证桩失真；CI core 260 条门禁；独立率 95.59%。</w:t>
       </w:r>
     </w:p>
     <w:p>
@@ -4457,7 +4457,7 @@
           <w:sz w:val="21"/>
           <w:rFonts w:eastAsia="宋体"/>
         </w:rPr>
-        <w:t>，核心验证已通过（账本 476 / 独立率 95.59% / CI core 259 / 三栈闭环），但</w:t>
+        <w:t>，核心验证已通过（账本 476 / 独立率 95.59% / CI core 260 / 三栈闭环），但</w:t>
       </w:r>
       <w:r>
         <w:rPr>
@@ -4917,7 +4917,7 @@
           <w:sz w:val="21"/>
           <w:rFonts w:eastAsia="宋体"/>
         </w:rPr>
-        <w:t>• LDA 内部运行账本（v0.9.169 源码实测）：476 锚 / 455 严格 / 3 降级 / 18 自证桩 / 独立率 95.59% / CI core 259 / ecore 24 模块 E1–E19 / 量子双栈 / 主权 GDS 9 例</w:t>
+        <w:t>• LDA 内部运行账本（v0.9.169 源码实测）：476 锚 / 455 严格 / 3 降级 / 18 自证桩 / 独立率 95.59% / CI core 260 / ecore 24 模块 E1–E19 / 量子双栈 / 主权 GDS 9 例</w:t>
       </w:r>
     </w:p>
     <w:sectPr>

</xml_diff>